<commit_message>
Hoan thanh cau 1
</commit_message>
<xml_diff>
--- a/Nguyễn Lưu Bảo Khang.docx
+++ b/Nguyễn Lưu Bảo Khang.docx
@@ -59,18 +59,8 @@
           <w:sz w:val="32"/>
           <w:szCs w:val="32"/>
         </w:rPr>
-        <w:t xml:space="preserve">Câu </w:t>
-      </w:r>
-      <w:proofErr w:type="gramStart"/>
-      <w:r>
-        <w:rPr>
-          <w:rFonts w:ascii="Times New Roman" w:hAnsi="Times New Roman" w:cs="Times New Roman"/>
-          <w:sz w:val="32"/>
-          <w:szCs w:val="32"/>
-        </w:rPr>
-        <w:t>1 :</w:t>
-      </w:r>
-      <w:proofErr w:type="gramEnd"/>
+        <w:t>Câu 1 :</w:t>
+      </w:r>
     </w:p>
     <w:p>
       <w:pPr>
@@ -261,6 +251,137 @@
           <w:szCs w:val="30"/>
         </w:rPr>
       </w:pPr>
+      <w:r>
+        <w:rPr>
+          <w:rFonts w:asciiTheme="majorHAnsi" w:hAnsiTheme="majorHAnsi" w:cstheme="majorHAnsi"/>
+          <w:b/>
+          <w:bCs/>
+          <w:sz w:val="30"/>
+          <w:szCs w:val="30"/>
+        </w:rPr>
+        <w:drawing>
+          <wp:inline distT="0" distB="0" distL="0" distR="0" wp14:anchorId="2A8C1322" wp14:editId="06CD3F09">
+            <wp:extent cx="5943600" cy="3341370"/>
+            <wp:effectExtent l="0" t="0" r="0" b="0"/>
+            <wp:docPr id="1862523110" name="Picture 1" descr="A screenshot of a computer&#10;&#10;Description automatically generated"/>
+            <wp:cNvGraphicFramePr>
+              <a:graphicFrameLocks xmlns:a="http://schemas.openxmlformats.org/drawingml/2006/main" noChangeAspect="1"/>
+            </wp:cNvGraphicFramePr>
+            <a:graphic xmlns:a="http://schemas.openxmlformats.org/drawingml/2006/main">
+              <a:graphicData uri="http://schemas.openxmlformats.org/drawingml/2006/picture">
+                <pic:pic xmlns:pic="http://schemas.openxmlformats.org/drawingml/2006/picture">
+                  <pic:nvPicPr>
+                    <pic:cNvPr id="1862523110" name="Picture 1" descr="A screenshot of a computer&#10;&#10;Description automatically generated"/>
+                    <pic:cNvPicPr/>
+                  </pic:nvPicPr>
+                  <pic:blipFill>
+                    <a:blip r:embed="rId6"/>
+                    <a:stretch>
+                      <a:fillRect/>
+                    </a:stretch>
+                  </pic:blipFill>
+                  <pic:spPr>
+                    <a:xfrm>
+                      <a:off x="0" y="0"/>
+                      <a:ext cx="5943600" cy="3341370"/>
+                    </a:xfrm>
+                    <a:prstGeom prst="rect">
+                      <a:avLst/>
+                    </a:prstGeom>
+                  </pic:spPr>
+                </pic:pic>
+              </a:graphicData>
+            </a:graphic>
+          </wp:inline>
+        </w:drawing>
+      </w:r>
+    </w:p>
+    <w:p>
+      <w:pPr>
+        <w:pStyle w:val="ListParagraph"/>
+        <w:spacing w:line="360" w:lineRule="auto"/>
+        <w:ind w:left="294"/>
+        <w:rPr>
+          <w:rFonts w:asciiTheme="majorHAnsi" w:hAnsiTheme="majorHAnsi" w:cstheme="majorHAnsi"/>
+          <w:b/>
+          <w:bCs/>
+          <w:sz w:val="30"/>
+          <w:szCs w:val="30"/>
+        </w:rPr>
+      </w:pPr>
+    </w:p>
+    <w:p>
+      <w:pPr>
+        <w:pStyle w:val="ListParagraph"/>
+        <w:spacing w:line="360" w:lineRule="auto"/>
+        <w:ind w:left="294"/>
+        <w:rPr>
+          <w:rFonts w:asciiTheme="majorHAnsi" w:hAnsiTheme="majorHAnsi" w:cstheme="majorHAnsi"/>
+          <w:b/>
+          <w:bCs/>
+          <w:sz w:val="30"/>
+          <w:szCs w:val="30"/>
+        </w:rPr>
+      </w:pPr>
+      <w:r>
+        <w:rPr>
+          <w:rFonts w:asciiTheme="majorHAnsi" w:hAnsiTheme="majorHAnsi" w:cstheme="majorHAnsi"/>
+          <w:b/>
+          <w:bCs/>
+          <w:sz w:val="30"/>
+          <w:szCs w:val="30"/>
+        </w:rPr>
+        <w:lastRenderedPageBreak/>
+        <w:drawing>
+          <wp:inline distT="0" distB="0" distL="0" distR="0" wp14:anchorId="6137C161" wp14:editId="43A1BAD4">
+            <wp:extent cx="5943600" cy="3341370"/>
+            <wp:effectExtent l="0" t="0" r="0" b="0"/>
+            <wp:docPr id="1888923001" name="Picture 1" descr="A screenshot of a computer&#10;&#10;Description automatically generated"/>
+            <wp:cNvGraphicFramePr>
+              <a:graphicFrameLocks xmlns:a="http://schemas.openxmlformats.org/drawingml/2006/main" noChangeAspect="1"/>
+            </wp:cNvGraphicFramePr>
+            <a:graphic xmlns:a="http://schemas.openxmlformats.org/drawingml/2006/main">
+              <a:graphicData uri="http://schemas.openxmlformats.org/drawingml/2006/picture">
+                <pic:pic xmlns:pic="http://schemas.openxmlformats.org/drawingml/2006/picture">
+                  <pic:nvPicPr>
+                    <pic:cNvPr id="1888923001" name="Picture 1" descr="A screenshot of a computer&#10;&#10;Description automatically generated"/>
+                    <pic:cNvPicPr/>
+                  </pic:nvPicPr>
+                  <pic:blipFill>
+                    <a:blip r:embed="rId7"/>
+                    <a:stretch>
+                      <a:fillRect/>
+                    </a:stretch>
+                  </pic:blipFill>
+                  <pic:spPr>
+                    <a:xfrm>
+                      <a:off x="0" y="0"/>
+                      <a:ext cx="5943600" cy="3341370"/>
+                    </a:xfrm>
+                    <a:prstGeom prst="rect">
+                      <a:avLst/>
+                    </a:prstGeom>
+                  </pic:spPr>
+                </pic:pic>
+              </a:graphicData>
+            </a:graphic>
+          </wp:inline>
+        </w:drawing>
+      </w:r>
+    </w:p>
+    <w:p>
+      <w:pPr>
+        <w:pStyle w:val="ListParagraph"/>
+        <w:spacing w:line="360" w:lineRule="auto"/>
+        <w:ind w:left="294"/>
+        <w:rPr>
+          <w:rFonts w:asciiTheme="majorHAnsi" w:hAnsiTheme="majorHAnsi" w:cstheme="majorHAnsi"/>
+          <w:b/>
+          <w:bCs/>
+          <w:sz w:val="30"/>
+          <w:szCs w:val="30"/>
+        </w:rPr>
+      </w:pPr>
     </w:p>
     <w:p>
       <w:pPr>
@@ -327,7 +448,7 @@
                     <pic:cNvPicPr/>
                   </pic:nvPicPr>
                   <pic:blipFill>
-                    <a:blip r:embed="rId6"/>
+                    <a:blip r:embed="rId8"/>
                     <a:stretch>
                       <a:fillRect/>
                     </a:stretch>
@@ -379,6 +500,61 @@
           <w:szCs w:val="30"/>
         </w:rPr>
       </w:pPr>
+      <w:r>
+        <w:rPr>
+          <w:rFonts w:asciiTheme="majorHAnsi" w:hAnsiTheme="majorHAnsi" w:cstheme="majorHAnsi"/>
+          <w:sz w:val="30"/>
+          <w:szCs w:val="30"/>
+        </w:rPr>
+        <w:lastRenderedPageBreak/>
+        <w:drawing>
+          <wp:inline distT="0" distB="0" distL="0" distR="0" wp14:anchorId="19AB88B5" wp14:editId="1F195824">
+            <wp:extent cx="5943600" cy="3341370"/>
+            <wp:effectExtent l="0" t="0" r="0" b="0"/>
+            <wp:docPr id="871707388" name="Picture 1" descr="A screenshot of a computer&#10;&#10;Description automatically generated"/>
+            <wp:cNvGraphicFramePr>
+              <a:graphicFrameLocks xmlns:a="http://schemas.openxmlformats.org/drawingml/2006/main" noChangeAspect="1"/>
+            </wp:cNvGraphicFramePr>
+            <a:graphic xmlns:a="http://schemas.openxmlformats.org/drawingml/2006/main">
+              <a:graphicData uri="http://schemas.openxmlformats.org/drawingml/2006/picture">
+                <pic:pic xmlns:pic="http://schemas.openxmlformats.org/drawingml/2006/picture">
+                  <pic:nvPicPr>
+                    <pic:cNvPr id="871707388" name="Picture 1" descr="A screenshot of a computer&#10;&#10;Description automatically generated"/>
+                    <pic:cNvPicPr/>
+                  </pic:nvPicPr>
+                  <pic:blipFill>
+                    <a:blip r:embed="rId9"/>
+                    <a:stretch>
+                      <a:fillRect/>
+                    </a:stretch>
+                  </pic:blipFill>
+                  <pic:spPr>
+                    <a:xfrm>
+                      <a:off x="0" y="0"/>
+                      <a:ext cx="5943600" cy="3341370"/>
+                    </a:xfrm>
+                    <a:prstGeom prst="rect">
+                      <a:avLst/>
+                    </a:prstGeom>
+                  </pic:spPr>
+                </pic:pic>
+              </a:graphicData>
+            </a:graphic>
+          </wp:inline>
+        </w:drawing>
+      </w:r>
+    </w:p>
+    <w:p>
+      <w:pPr>
+        <w:pStyle w:val="ListParagraph"/>
+        <w:spacing w:line="360" w:lineRule="auto"/>
+        <w:ind w:left="294"/>
+        <w:rPr>
+          <w:rFonts w:asciiTheme="majorHAnsi" w:hAnsiTheme="majorHAnsi" w:cstheme="majorHAnsi"/>
+          <w:sz w:val="30"/>
+          <w:szCs w:val="30"/>
+        </w:rPr>
+      </w:pPr>
     </w:p>
     <w:p>
       <w:pPr>
@@ -445,7 +621,7 @@
                     <pic:cNvPicPr/>
                   </pic:nvPicPr>
                   <pic:blipFill>
-                    <a:blip r:embed="rId7"/>
+                    <a:blip r:embed="rId10"/>
                     <a:stretch>
                       <a:fillRect/>
                     </a:stretch>
@@ -511,6 +687,63 @@
         <w:ind w:left="294"/>
         <w:rPr>
           <w:rFonts w:asciiTheme="majorHAnsi" w:hAnsiTheme="majorHAnsi" w:cstheme="majorHAnsi"/>
+          <w:color w:val="70AD47" w:themeColor="accent6"/>
+          <w:sz w:val="28"/>
+          <w:szCs w:val="28"/>
+        </w:rPr>
+      </w:pPr>
+      <w:r>
+        <w:rPr>
+          <w:rFonts w:asciiTheme="majorHAnsi" w:hAnsiTheme="majorHAnsi" w:cstheme="majorHAnsi"/>
+          <w:color w:val="70AD47" w:themeColor="accent6"/>
+          <w:sz w:val="28"/>
+          <w:szCs w:val="28"/>
+        </w:rPr>
+        <w:lastRenderedPageBreak/>
+        <w:drawing>
+          <wp:inline distT="0" distB="0" distL="0" distR="0" wp14:anchorId="77D80157" wp14:editId="1EF6CAA4">
+            <wp:extent cx="5943600" cy="3341370"/>
+            <wp:effectExtent l="0" t="0" r="0" b="0"/>
+            <wp:docPr id="126571052" name="Picture 1" descr="A screenshot of a computer&#10;&#10;Description automatically generated"/>
+            <wp:cNvGraphicFramePr>
+              <a:graphicFrameLocks xmlns:a="http://schemas.openxmlformats.org/drawingml/2006/main" noChangeAspect="1"/>
+            </wp:cNvGraphicFramePr>
+            <a:graphic xmlns:a="http://schemas.openxmlformats.org/drawingml/2006/main">
+              <a:graphicData uri="http://schemas.openxmlformats.org/drawingml/2006/picture">
+                <pic:pic xmlns:pic="http://schemas.openxmlformats.org/drawingml/2006/picture">
+                  <pic:nvPicPr>
+                    <pic:cNvPr id="126571052" name="Picture 1" descr="A screenshot of a computer&#10;&#10;Description automatically generated"/>
+                    <pic:cNvPicPr/>
+                  </pic:nvPicPr>
+                  <pic:blipFill>
+                    <a:blip r:embed="rId11"/>
+                    <a:stretch>
+                      <a:fillRect/>
+                    </a:stretch>
+                  </pic:blipFill>
+                  <pic:spPr>
+                    <a:xfrm>
+                      <a:off x="0" y="0"/>
+                      <a:ext cx="5943600" cy="3341370"/>
+                    </a:xfrm>
+                    <a:prstGeom prst="rect">
+                      <a:avLst/>
+                    </a:prstGeom>
+                  </pic:spPr>
+                </pic:pic>
+              </a:graphicData>
+            </a:graphic>
+          </wp:inline>
+        </w:drawing>
+      </w:r>
+    </w:p>
+    <w:p>
+      <w:pPr>
+        <w:pStyle w:val="ListParagraph"/>
+        <w:spacing w:line="360" w:lineRule="auto"/>
+        <w:ind w:left="294"/>
+        <w:rPr>
+          <w:rFonts w:asciiTheme="majorHAnsi" w:hAnsiTheme="majorHAnsi" w:cstheme="majorHAnsi"/>
           <w:sz w:val="28"/>
           <w:szCs w:val="28"/>
         </w:rPr>
@@ -581,7 +814,7 @@
                     <pic:cNvPicPr/>
                   </pic:nvPicPr>
                   <pic:blipFill>
-                    <a:blip r:embed="rId8"/>
+                    <a:blip r:embed="rId12"/>
                     <a:stretch>
                       <a:fillRect/>
                     </a:stretch>
@@ -619,8 +852,62 @@
           <w:sz w:val="28"/>
           <w:szCs w:val="28"/>
         </w:rPr>
+        <w:t>Lấy stash mới nhất (thường là stash@{0}) và áp dụng nó vào nhánh hiện tại, đồng thời xóa khỏi danh sách stash</w:t>
+      </w:r>
+    </w:p>
+    <w:p>
+      <w:pPr>
+        <w:pStyle w:val="ListParagraph"/>
+        <w:spacing w:line="360" w:lineRule="auto"/>
+        <w:ind w:left="294"/>
+        <w:rPr>
+          <w:rFonts w:asciiTheme="majorHAnsi" w:hAnsiTheme="majorHAnsi" w:cstheme="majorHAnsi"/>
+          <w:sz w:val="28"/>
+          <w:szCs w:val="28"/>
+        </w:rPr>
+      </w:pPr>
+      <w:r>
+        <w:rPr>
+          <w:rFonts w:asciiTheme="majorHAnsi" w:hAnsiTheme="majorHAnsi" w:cstheme="majorHAnsi"/>
+          <w:sz w:val="28"/>
+          <w:szCs w:val="28"/>
+        </w:rPr>
         <w:lastRenderedPageBreak/>
-        <w:t>Lấy stash mới nhất (thường là stash@{0}) và áp dụng nó vào nhánh hiện tại, đồng thời xóa khỏi danh sách stash</w:t>
+        <w:drawing>
+          <wp:inline distT="0" distB="0" distL="0" distR="0" wp14:anchorId="0ABE7FD3" wp14:editId="0E0A9622">
+            <wp:extent cx="5943600" cy="3341370"/>
+            <wp:effectExtent l="0" t="0" r="0" b="0"/>
+            <wp:docPr id="1109976222" name="Picture 1" descr="A computer screen shot of a computer screen&#10;&#10;Description automatically generated"/>
+            <wp:cNvGraphicFramePr>
+              <a:graphicFrameLocks xmlns:a="http://schemas.openxmlformats.org/drawingml/2006/main" noChangeAspect="1"/>
+            </wp:cNvGraphicFramePr>
+            <a:graphic xmlns:a="http://schemas.openxmlformats.org/drawingml/2006/main">
+              <a:graphicData uri="http://schemas.openxmlformats.org/drawingml/2006/picture">
+                <pic:pic xmlns:pic="http://schemas.openxmlformats.org/drawingml/2006/picture">
+                  <pic:nvPicPr>
+                    <pic:cNvPr id="1109976222" name="Picture 1" descr="A computer screen shot of a computer screen&#10;&#10;Description automatically generated"/>
+                    <pic:cNvPicPr/>
+                  </pic:nvPicPr>
+                  <pic:blipFill>
+                    <a:blip r:embed="rId13"/>
+                    <a:stretch>
+                      <a:fillRect/>
+                    </a:stretch>
+                  </pic:blipFill>
+                  <pic:spPr>
+                    <a:xfrm>
+                      <a:off x="0" y="0"/>
+                      <a:ext cx="5943600" cy="3341370"/>
+                    </a:xfrm>
+                    <a:prstGeom prst="rect">
+                      <a:avLst/>
+                    </a:prstGeom>
+                  </pic:spPr>
+                </pic:pic>
+              </a:graphicData>
+            </a:graphic>
+          </wp:inline>
+        </w:drawing>
       </w:r>
     </w:p>
     <w:p>
@@ -700,7 +987,7 @@
                     <pic:cNvPicPr/>
                   </pic:nvPicPr>
                   <pic:blipFill>
-                    <a:blip r:embed="rId9"/>
+                    <a:blip r:embed="rId14"/>
                     <a:stretch>
                       <a:fillRect/>
                     </a:stretch>
@@ -752,6 +1039,127 @@
           <w:szCs w:val="28"/>
         </w:rPr>
       </w:pPr>
+      <w:r>
+        <w:rPr>
+          <w:rFonts w:asciiTheme="majorHAnsi" w:hAnsiTheme="majorHAnsi" w:cstheme="majorHAnsi"/>
+          <w:sz w:val="28"/>
+          <w:szCs w:val="28"/>
+        </w:rPr>
+        <w:lastRenderedPageBreak/>
+        <w:drawing>
+          <wp:inline distT="0" distB="0" distL="0" distR="0" wp14:anchorId="31875954" wp14:editId="3377D885">
+            <wp:extent cx="5943600" cy="3341370"/>
+            <wp:effectExtent l="0" t="0" r="0" b="0"/>
+            <wp:docPr id="1991107785" name="Picture 1" descr="A computer screen shot of a computer screen&#10;&#10;Description automatically generated"/>
+            <wp:cNvGraphicFramePr>
+              <a:graphicFrameLocks xmlns:a="http://schemas.openxmlformats.org/drawingml/2006/main" noChangeAspect="1"/>
+            </wp:cNvGraphicFramePr>
+            <a:graphic xmlns:a="http://schemas.openxmlformats.org/drawingml/2006/main">
+              <a:graphicData uri="http://schemas.openxmlformats.org/drawingml/2006/picture">
+                <pic:pic xmlns:pic="http://schemas.openxmlformats.org/drawingml/2006/picture">
+                  <pic:nvPicPr>
+                    <pic:cNvPr id="1991107785" name="Picture 1" descr="A computer screen shot of a computer screen&#10;&#10;Description automatically generated"/>
+                    <pic:cNvPicPr/>
+                  </pic:nvPicPr>
+                  <pic:blipFill>
+                    <a:blip r:embed="rId15"/>
+                    <a:stretch>
+                      <a:fillRect/>
+                    </a:stretch>
+                  </pic:blipFill>
+                  <pic:spPr>
+                    <a:xfrm>
+                      <a:off x="0" y="0"/>
+                      <a:ext cx="5943600" cy="3341370"/>
+                    </a:xfrm>
+                    <a:prstGeom prst="rect">
+                      <a:avLst/>
+                    </a:prstGeom>
+                  </pic:spPr>
+                </pic:pic>
+              </a:graphicData>
+            </a:graphic>
+          </wp:inline>
+        </w:drawing>
+      </w:r>
+    </w:p>
+    <w:p>
+      <w:pPr>
+        <w:pStyle w:val="ListParagraph"/>
+        <w:spacing w:line="360" w:lineRule="auto"/>
+        <w:ind w:left="294"/>
+        <w:rPr>
+          <w:rFonts w:asciiTheme="majorHAnsi" w:hAnsiTheme="majorHAnsi" w:cstheme="majorHAnsi"/>
+          <w:sz w:val="28"/>
+          <w:szCs w:val="28"/>
+        </w:rPr>
+      </w:pPr>
+    </w:p>
+    <w:p>
+      <w:pPr>
+        <w:pStyle w:val="ListParagraph"/>
+        <w:spacing w:line="360" w:lineRule="auto"/>
+        <w:ind w:left="294"/>
+        <w:rPr>
+          <w:rFonts w:asciiTheme="majorHAnsi" w:hAnsiTheme="majorHAnsi" w:cstheme="majorHAnsi"/>
+          <w:sz w:val="28"/>
+          <w:szCs w:val="28"/>
+        </w:rPr>
+      </w:pPr>
+      <w:r>
+        <w:rPr>
+          <w:rFonts w:asciiTheme="majorHAnsi" w:hAnsiTheme="majorHAnsi" w:cstheme="majorHAnsi"/>
+          <w:sz w:val="28"/>
+          <w:szCs w:val="28"/>
+        </w:rPr>
+        <w:drawing>
+          <wp:inline distT="0" distB="0" distL="0" distR="0" wp14:anchorId="4D9A4022" wp14:editId="652F70D3">
+            <wp:extent cx="5943600" cy="3341370"/>
+            <wp:effectExtent l="0" t="0" r="0" b="0"/>
+            <wp:docPr id="2007787814" name="Picture 1" descr="A computer screen shot of a computer screen&#10;&#10;Description automatically generated"/>
+            <wp:cNvGraphicFramePr>
+              <a:graphicFrameLocks xmlns:a="http://schemas.openxmlformats.org/drawingml/2006/main" noChangeAspect="1"/>
+            </wp:cNvGraphicFramePr>
+            <a:graphic xmlns:a="http://schemas.openxmlformats.org/drawingml/2006/main">
+              <a:graphicData uri="http://schemas.openxmlformats.org/drawingml/2006/picture">
+                <pic:pic xmlns:pic="http://schemas.openxmlformats.org/drawingml/2006/picture">
+                  <pic:nvPicPr>
+                    <pic:cNvPr id="2007787814" name="Picture 1" descr="A computer screen shot of a computer screen&#10;&#10;Description automatically generated"/>
+                    <pic:cNvPicPr/>
+                  </pic:nvPicPr>
+                  <pic:blipFill>
+                    <a:blip r:embed="rId16"/>
+                    <a:stretch>
+                      <a:fillRect/>
+                    </a:stretch>
+                  </pic:blipFill>
+                  <pic:spPr>
+                    <a:xfrm>
+                      <a:off x="0" y="0"/>
+                      <a:ext cx="5943600" cy="3341370"/>
+                    </a:xfrm>
+                    <a:prstGeom prst="rect">
+                      <a:avLst/>
+                    </a:prstGeom>
+                  </pic:spPr>
+                </pic:pic>
+              </a:graphicData>
+            </a:graphic>
+          </wp:inline>
+        </w:drawing>
+      </w:r>
+    </w:p>
+    <w:p>
+      <w:pPr>
+        <w:pStyle w:val="ListParagraph"/>
+        <w:spacing w:line="360" w:lineRule="auto"/>
+        <w:ind w:left="294"/>
+        <w:rPr>
+          <w:rFonts w:asciiTheme="majorHAnsi" w:hAnsiTheme="majorHAnsi" w:cstheme="majorHAnsi"/>
+          <w:sz w:val="28"/>
+          <w:szCs w:val="28"/>
+        </w:rPr>
+      </w:pPr>
     </w:p>
     <w:p>
       <w:pPr>
@@ -802,6 +1210,7 @@
           <w:sz w:val="30"/>
           <w:szCs w:val="30"/>
         </w:rPr>
+        <w:lastRenderedPageBreak/>
         <w:drawing>
           <wp:inline distT="0" distB="0" distL="0" distR="0" wp14:anchorId="2FEC03B9" wp14:editId="0C57AD92">
             <wp:extent cx="2286319" cy="390580"/>
@@ -818,7 +1227,7 @@
                     <pic:cNvPicPr/>
                   </pic:nvPicPr>
                   <pic:blipFill>
-                    <a:blip r:embed="rId10"/>
+                    <a:blip r:embed="rId17"/>
                     <a:stretch>
                       <a:fillRect/>
                     </a:stretch>
@@ -870,6 +1279,126 @@
           <w:szCs w:val="28"/>
         </w:rPr>
       </w:pPr>
+      <w:r>
+        <w:rPr>
+          <w:rFonts w:asciiTheme="majorHAnsi" w:hAnsiTheme="majorHAnsi" w:cstheme="majorHAnsi"/>
+          <w:sz w:val="28"/>
+          <w:szCs w:val="28"/>
+        </w:rPr>
+        <w:drawing>
+          <wp:inline distT="0" distB="0" distL="0" distR="0" wp14:anchorId="6459E6D6" wp14:editId="541AC7C0">
+            <wp:extent cx="5943600" cy="3341370"/>
+            <wp:effectExtent l="0" t="0" r="0" b="0"/>
+            <wp:docPr id="1418423677" name="Picture 1" descr="A computer screen shot of a computer screen&#10;&#10;Description automatically generated"/>
+            <wp:cNvGraphicFramePr>
+              <a:graphicFrameLocks xmlns:a="http://schemas.openxmlformats.org/drawingml/2006/main" noChangeAspect="1"/>
+            </wp:cNvGraphicFramePr>
+            <a:graphic xmlns:a="http://schemas.openxmlformats.org/drawingml/2006/main">
+              <a:graphicData uri="http://schemas.openxmlformats.org/drawingml/2006/picture">
+                <pic:pic xmlns:pic="http://schemas.openxmlformats.org/drawingml/2006/picture">
+                  <pic:nvPicPr>
+                    <pic:cNvPr id="1418423677" name="Picture 1" descr="A computer screen shot of a computer screen&#10;&#10;Description automatically generated"/>
+                    <pic:cNvPicPr/>
+                  </pic:nvPicPr>
+                  <pic:blipFill>
+                    <a:blip r:embed="rId18"/>
+                    <a:stretch>
+                      <a:fillRect/>
+                    </a:stretch>
+                  </pic:blipFill>
+                  <pic:spPr>
+                    <a:xfrm>
+                      <a:off x="0" y="0"/>
+                      <a:ext cx="5943600" cy="3341370"/>
+                    </a:xfrm>
+                    <a:prstGeom prst="rect">
+                      <a:avLst/>
+                    </a:prstGeom>
+                  </pic:spPr>
+                </pic:pic>
+              </a:graphicData>
+            </a:graphic>
+          </wp:inline>
+        </w:drawing>
+      </w:r>
+    </w:p>
+    <w:p>
+      <w:pPr>
+        <w:pStyle w:val="ListParagraph"/>
+        <w:spacing w:line="360" w:lineRule="auto"/>
+        <w:ind w:left="294"/>
+        <w:rPr>
+          <w:rFonts w:asciiTheme="majorHAnsi" w:hAnsiTheme="majorHAnsi" w:cstheme="majorHAnsi"/>
+          <w:sz w:val="28"/>
+          <w:szCs w:val="28"/>
+        </w:rPr>
+      </w:pPr>
+    </w:p>
+    <w:p>
+      <w:pPr>
+        <w:pStyle w:val="ListParagraph"/>
+        <w:spacing w:line="360" w:lineRule="auto"/>
+        <w:ind w:left="294"/>
+        <w:rPr>
+          <w:rFonts w:asciiTheme="majorHAnsi" w:hAnsiTheme="majorHAnsi" w:cstheme="majorHAnsi"/>
+          <w:sz w:val="28"/>
+          <w:szCs w:val="28"/>
+        </w:rPr>
+      </w:pPr>
+      <w:r>
+        <w:rPr>
+          <w:rFonts w:asciiTheme="majorHAnsi" w:hAnsiTheme="majorHAnsi" w:cstheme="majorHAnsi"/>
+          <w:sz w:val="28"/>
+          <w:szCs w:val="28"/>
+        </w:rPr>
+        <w:drawing>
+          <wp:inline distT="0" distB="0" distL="0" distR="0" wp14:anchorId="5962F2F3" wp14:editId="7988A1A6">
+            <wp:extent cx="5943600" cy="3341370"/>
+            <wp:effectExtent l="0" t="0" r="0" b="0"/>
+            <wp:docPr id="1430810725" name="Picture 1" descr="A screenshot of a computer&#10;&#10;Description automatically generated"/>
+            <wp:cNvGraphicFramePr>
+              <a:graphicFrameLocks xmlns:a="http://schemas.openxmlformats.org/drawingml/2006/main" noChangeAspect="1"/>
+            </wp:cNvGraphicFramePr>
+            <a:graphic xmlns:a="http://schemas.openxmlformats.org/drawingml/2006/main">
+              <a:graphicData uri="http://schemas.openxmlformats.org/drawingml/2006/picture">
+                <pic:pic xmlns:pic="http://schemas.openxmlformats.org/drawingml/2006/picture">
+                  <pic:nvPicPr>
+                    <pic:cNvPr id="1430810725" name="Picture 1" descr="A screenshot of a computer&#10;&#10;Description automatically generated"/>
+                    <pic:cNvPicPr/>
+                  </pic:nvPicPr>
+                  <pic:blipFill>
+                    <a:blip r:embed="rId19"/>
+                    <a:stretch>
+                      <a:fillRect/>
+                    </a:stretch>
+                  </pic:blipFill>
+                  <pic:spPr>
+                    <a:xfrm>
+                      <a:off x="0" y="0"/>
+                      <a:ext cx="5943600" cy="3341370"/>
+                    </a:xfrm>
+                    <a:prstGeom prst="rect">
+                      <a:avLst/>
+                    </a:prstGeom>
+                  </pic:spPr>
+                </pic:pic>
+              </a:graphicData>
+            </a:graphic>
+          </wp:inline>
+        </w:drawing>
+      </w:r>
+    </w:p>
+    <w:p>
+      <w:pPr>
+        <w:pStyle w:val="ListParagraph"/>
+        <w:spacing w:line="360" w:lineRule="auto"/>
+        <w:ind w:left="294"/>
+        <w:rPr>
+          <w:rFonts w:asciiTheme="majorHAnsi" w:hAnsiTheme="majorHAnsi" w:cstheme="majorHAnsi"/>
+          <w:sz w:val="28"/>
+          <w:szCs w:val="28"/>
+        </w:rPr>
+      </w:pPr>
     </w:p>
     <w:p>
       <w:pPr>
@@ -936,7 +1465,7 @@
                     <pic:cNvPicPr/>
                   </pic:nvPicPr>
                   <pic:blipFill>
-                    <a:blip r:embed="rId11"/>
+                    <a:blip r:embed="rId20"/>
                     <a:stretch>
                       <a:fillRect/>
                     </a:stretch>
@@ -988,6 +1517,48 @@
           <w:szCs w:val="28"/>
         </w:rPr>
       </w:pPr>
+      <w:r>
+        <w:rPr>
+          <w:rFonts w:asciiTheme="majorHAnsi" w:hAnsiTheme="majorHAnsi" w:cstheme="majorHAnsi"/>
+          <w:sz w:val="28"/>
+          <w:szCs w:val="28"/>
+        </w:rPr>
+        <w:drawing>
+          <wp:inline distT="0" distB="0" distL="0" distR="0" wp14:anchorId="52C5873B" wp14:editId="41912A4B">
+            <wp:extent cx="5943600" cy="3341370"/>
+            <wp:effectExtent l="0" t="0" r="0" b="0"/>
+            <wp:docPr id="501599241" name="Picture 1" descr="A screenshot of a computer&#10;&#10;Description automatically generated"/>
+            <wp:cNvGraphicFramePr>
+              <a:graphicFrameLocks xmlns:a="http://schemas.openxmlformats.org/drawingml/2006/main" noChangeAspect="1"/>
+            </wp:cNvGraphicFramePr>
+            <a:graphic xmlns:a="http://schemas.openxmlformats.org/drawingml/2006/main">
+              <a:graphicData uri="http://schemas.openxmlformats.org/drawingml/2006/picture">
+                <pic:pic xmlns:pic="http://schemas.openxmlformats.org/drawingml/2006/picture">
+                  <pic:nvPicPr>
+                    <pic:cNvPr id="501599241" name="Picture 1" descr="A screenshot of a computer&#10;&#10;Description automatically generated"/>
+                    <pic:cNvPicPr/>
+                  </pic:nvPicPr>
+                  <pic:blipFill>
+                    <a:blip r:embed="rId21"/>
+                    <a:stretch>
+                      <a:fillRect/>
+                    </a:stretch>
+                  </pic:blipFill>
+                  <pic:spPr>
+                    <a:xfrm>
+                      <a:off x="0" y="0"/>
+                      <a:ext cx="5943600" cy="3341370"/>
+                    </a:xfrm>
+                    <a:prstGeom prst="rect">
+                      <a:avLst/>
+                    </a:prstGeom>
+                  </pic:spPr>
+                </pic:pic>
+              </a:graphicData>
+            </a:graphic>
+          </wp:inline>
+        </w:drawing>
+      </w:r>
     </w:p>
     <w:p>
       <w:pPr>
@@ -1054,7 +1625,7 @@
                     <pic:cNvPicPr/>
                   </pic:nvPicPr>
                   <pic:blipFill>
-                    <a:blip r:embed="rId12"/>
+                    <a:blip r:embed="rId22"/>
                     <a:stretch>
                       <a:fillRect/>
                     </a:stretch>
@@ -1095,7 +1666,46 @@
         <w:t>Xóa tất cả stash đã lưu</w:t>
       </w:r>
     </w:p>
-    <w:p/>
+    <w:p>
+      <w:r>
+        <w:lastRenderedPageBreak/>
+        <w:drawing>
+          <wp:inline distT="0" distB="0" distL="0" distR="0" wp14:anchorId="07BB259B" wp14:editId="7B064461">
+            <wp:extent cx="5943600" cy="3341370"/>
+            <wp:effectExtent l="0" t="0" r="0" b="0"/>
+            <wp:docPr id="168161384" name="Picture 1"/>
+            <wp:cNvGraphicFramePr>
+              <a:graphicFrameLocks xmlns:a="http://schemas.openxmlformats.org/drawingml/2006/main" noChangeAspect="1"/>
+            </wp:cNvGraphicFramePr>
+            <a:graphic xmlns:a="http://schemas.openxmlformats.org/drawingml/2006/main">
+              <a:graphicData uri="http://schemas.openxmlformats.org/drawingml/2006/picture">
+                <pic:pic xmlns:pic="http://schemas.openxmlformats.org/drawingml/2006/picture">
+                  <pic:nvPicPr>
+                    <pic:cNvPr id="168161384" name=""/>
+                    <pic:cNvPicPr/>
+                  </pic:nvPicPr>
+                  <pic:blipFill>
+                    <a:blip r:embed="rId23"/>
+                    <a:stretch>
+                      <a:fillRect/>
+                    </a:stretch>
+                  </pic:blipFill>
+                  <pic:spPr>
+                    <a:xfrm>
+                      <a:off x="0" y="0"/>
+                      <a:ext cx="5943600" cy="3341370"/>
+                    </a:xfrm>
+                    <a:prstGeom prst="rect">
+                      <a:avLst/>
+                    </a:prstGeom>
+                  </pic:spPr>
+                </pic:pic>
+              </a:graphicData>
+            </a:graphic>
+          </wp:inline>
+        </w:drawing>
+      </w:r>
+    </w:p>
     <w:sectPr>
       <w:pgSz w:w="12240" w:h="15840"/>
       <w:pgMar w:top="1440" w:right="1440" w:bottom="1440" w:left="1440" w:header="720" w:footer="720" w:gutter="0"/>

</xml_diff>